<commit_message>
feat: tambahkan fitur kelola akun kasir, admin, dan petugas operasional
</commit_message>
<xml_diff>
--- a/LKPD/LKPD_Kelompok_2_Sistem_Parkir_Member.docx
+++ b/LKPD/LKPD_Kelompok_2_Sistem_Parkir_Member.docx
@@ -1042,7 +1042,7 @@
           <w:szCs w:val="22"/>
           <w:rtl w:val="0"/>
         </w:rPr>
-        <w:t xml:space="preserve">Sistem ini dirancang khusus untuk mengelola akses otomatis kendaraan bagi member yang berlangganan secara periodik (bulanan), menggantikan tiket karcis manual dengan verifikasi masa aktif akun member secara digital.</w:t>
+        <w:t xml:space="preserve">Sistem ini dirancang khusus untuk mengelola akses otomatis kendaraan bagi member yang berlangganan secara periodik (bulanan), dengan fokus 100% khusus melayani kendaraan member terdaftar (tidak melayani parkir umum/non-member), melalui verifikasi masa aktif akun member secara digital.</w:t>
       </w:r>
       <w:r>
         <w:rPr>
@@ -7502,7 +7502,7 @@
                 <w:szCs w:val="19"/>
                 <w:rtl w:val="0"/>
               </w:rPr>
-              <w:t xml:space="preserve">Salam, perkenalan anggota kelompok 2, dan penjelasan urgensi sistem parkir member otomatis untuk mengurangi antrean karcis harian.</w:t>
+              <w:t xml:space="preserve">Salam, perkenalan anggota kelompok 2, dan penjelasan urgensi sistem parkir member otomatis untuk menjamin hak dan kelancaran akses parkir eksklusif bagi seluruh member terdaftar tanpa hambatan antrean umum.</w:t>
             </w:r>
             <w:r>
               <w:rPr>

</xml_diff>